<commit_message>
Update Project 3 site branding with GitHub and LinkedIn links.
Co-authored-by: Cursor <cursoragent@cursor.com>
</commit_message>
<xml_diff>
--- a/project-3-static-site/docs/Project 3 – Milestone Screenshots.docx
+++ b/project-3-static-site/docs/Project 3 – Milestone Screenshots.docx
@@ -162,6 +162,58 @@
         </w:drawing>
       </w:r>
     </w:p>
+    <w:p>
+      <w:r>
+        <w:lastRenderedPageBreak/>
+        <w:drawing>
+          <wp:inline distT="0" distB="0" distL="0" distR="0" wp14:anchorId="36F260CB" wp14:editId="0B782284">
+            <wp:extent cx="5468113" cy="2581635"/>
+            <wp:effectExtent l="0" t="0" r="0" b="9525"/>
+            <wp:docPr id="618289895" name="Picture 1"/>
+            <wp:cNvGraphicFramePr>
+              <a:graphicFrameLocks xmlns:a="http://schemas.openxmlformats.org/drawingml/2006/main" noChangeAspect="1"/>
+            </wp:cNvGraphicFramePr>
+            <a:graphic xmlns:a="http://schemas.openxmlformats.org/drawingml/2006/main">
+              <a:graphicData uri="http://schemas.openxmlformats.org/drawingml/2006/picture">
+                <pic:pic xmlns:pic="http://schemas.openxmlformats.org/drawingml/2006/picture">
+                  <pic:nvPicPr>
+                    <pic:cNvPr id="618289895" name=""/>
+                    <pic:cNvPicPr/>
+                  </pic:nvPicPr>
+                  <pic:blipFill>
+                    <a:blip r:embed="rId9"/>
+                    <a:stretch>
+                      <a:fillRect/>
+                    </a:stretch>
+                  </pic:blipFill>
+                  <pic:spPr>
+                    <a:xfrm>
+                      <a:off x="0" y="0"/>
+                      <a:ext cx="5468113" cy="2581635"/>
+                    </a:xfrm>
+                    <a:prstGeom prst="rect">
+                      <a:avLst/>
+                    </a:prstGeom>
+                  </pic:spPr>
+                </pic:pic>
+              </a:graphicData>
+            </a:graphic>
+          </wp:inline>
+        </w:drawing>
+      </w:r>
+    </w:p>
+    <w:p>
+      <w:pPr>
+        <w:pStyle w:val="ListParagraph"/>
+        <w:numPr>
+          <w:ilvl w:val="0"/>
+          <w:numId w:val="1"/>
+        </w:numPr>
+      </w:pPr>
+      <w:r>
+        <w:t>Lambda function counter in console.</w:t>
+      </w:r>
+    </w:p>
     <w:p/>
     <w:sectPr>
       <w:pgSz w:w="12240" w:h="15840"/>
@@ -178,7 +230,7 @@
   <w:abstractNum w:abstractNumId="0" w15:restartNumberingAfterBreak="0">
     <w:nsid w:val="61827CBB"/>
     <w:multiLevelType w:val="hybridMultilevel"/>
-    <w:tmpl w:val="95F45420"/>
+    <w:tmpl w:val="53C2B12A"/>
     <w:lvl w:ilvl="0" w:tplc="04090001">
       <w:start w:val="1"/>
       <w:numFmt w:val="bullet"/>

</xml_diff>

<commit_message>
Update Project 3 milestone screenshots documentation.
Co-authored-by: Cursor <cursoragent@cursor.com>
</commit_message>
<xml_diff>
--- a/project-3-static-site/docs/Project 3 – Milestone Screenshots.docx
+++ b/project-3-static-site/docs/Project 3 – Milestone Screenshots.docx
@@ -123,48 +123,9 @@
         </w:r>
       </w:hyperlink>
     </w:p>
+    <w:p/>
     <w:p>
       <w:r>
-        <w:drawing>
-          <wp:inline distT="0" distB="0" distL="0" distR="0" wp14:anchorId="1657C2B0" wp14:editId="3FD49DD3">
-            <wp:extent cx="5744377" cy="3953427"/>
-            <wp:effectExtent l="0" t="0" r="8890" b="9525"/>
-            <wp:docPr id="1757799317" name="Picture 1"/>
-            <wp:cNvGraphicFramePr>
-              <a:graphicFrameLocks xmlns:a="http://schemas.openxmlformats.org/drawingml/2006/main" noChangeAspect="1"/>
-            </wp:cNvGraphicFramePr>
-            <a:graphic xmlns:a="http://schemas.openxmlformats.org/drawingml/2006/main">
-              <a:graphicData uri="http://schemas.openxmlformats.org/drawingml/2006/picture">
-                <pic:pic xmlns:pic="http://schemas.openxmlformats.org/drawingml/2006/picture">
-                  <pic:nvPicPr>
-                    <pic:cNvPr id="1757799317" name=""/>
-                    <pic:cNvPicPr/>
-                  </pic:nvPicPr>
-                  <pic:blipFill>
-                    <a:blip r:embed="rId8"/>
-                    <a:stretch>
-                      <a:fillRect/>
-                    </a:stretch>
-                  </pic:blipFill>
-                  <pic:spPr>
-                    <a:xfrm>
-                      <a:off x="0" y="0"/>
-                      <a:ext cx="5744377" cy="3953427"/>
-                    </a:xfrm>
-                    <a:prstGeom prst="rect">
-                      <a:avLst/>
-                    </a:prstGeom>
-                  </pic:spPr>
-                </pic:pic>
-              </a:graphicData>
-            </a:graphic>
-          </wp:inline>
-        </w:drawing>
-      </w:r>
-    </w:p>
-    <w:p>
-      <w:r>
-        <w:lastRenderedPageBreak/>
         <w:drawing>
           <wp:inline distT="0" distB="0" distL="0" distR="0" wp14:anchorId="36F260CB" wp14:editId="0B782284">
             <wp:extent cx="5468113" cy="2581635"/>
@@ -181,7 +142,7 @@
                     <pic:cNvPicPr/>
                   </pic:nvPicPr>
                   <pic:blipFill>
-                    <a:blip r:embed="rId9"/>
+                    <a:blip r:embed="rId8"/>
                     <a:stretch>
                       <a:fillRect/>
                     </a:stretch>
@@ -214,7 +175,61 @@
         <w:t>Lambda function counter in console.</w:t>
       </w:r>
     </w:p>
-    <w:p/>
+    <w:p>
+      <w:r>
+        <w:lastRenderedPageBreak/>
+        <w:drawing>
+          <wp:inline distT="0" distB="0" distL="0" distR="0" wp14:anchorId="72B9B39C" wp14:editId="592C4F26">
+            <wp:extent cx="5391902" cy="4105848"/>
+            <wp:effectExtent l="0" t="0" r="0" b="9525"/>
+            <wp:docPr id="861407580" name="Picture 1"/>
+            <wp:cNvGraphicFramePr>
+              <a:graphicFrameLocks xmlns:a="http://schemas.openxmlformats.org/drawingml/2006/main" noChangeAspect="1"/>
+            </wp:cNvGraphicFramePr>
+            <a:graphic xmlns:a="http://schemas.openxmlformats.org/drawingml/2006/main">
+              <a:graphicData uri="http://schemas.openxmlformats.org/drawingml/2006/picture">
+                <pic:pic xmlns:pic="http://schemas.openxmlformats.org/drawingml/2006/picture">
+                  <pic:nvPicPr>
+                    <pic:cNvPr id="861407580" name=""/>
+                    <pic:cNvPicPr/>
+                  </pic:nvPicPr>
+                  <pic:blipFill>
+                    <a:blip r:embed="rId9"/>
+                    <a:stretch>
+                      <a:fillRect/>
+                    </a:stretch>
+                  </pic:blipFill>
+                  <pic:spPr>
+                    <a:xfrm>
+                      <a:off x="0" y="0"/>
+                      <a:ext cx="5391902" cy="4105848"/>
+                    </a:xfrm>
+                    <a:prstGeom prst="rect">
+                      <a:avLst/>
+                    </a:prstGeom>
+                  </pic:spPr>
+                </pic:pic>
+              </a:graphicData>
+            </a:graphic>
+          </wp:inline>
+        </w:drawing>
+      </w:r>
+    </w:p>
+    <w:p>
+      <w:pPr>
+        <w:pStyle w:val="ListParagraph"/>
+        <w:numPr>
+          <w:ilvl w:val="0"/>
+          <w:numId w:val="1"/>
+        </w:numPr>
+      </w:pPr>
+      <w:r>
+        <w:t>S</w:t>
+      </w:r>
+      <w:r>
+        <w:t>ite landing page</w:t>
+      </w:r>
+    </w:p>
     <w:sectPr>
       <w:pgSz w:w="12240" w:h="15840"/>
       <w:pgMar w:top="1440" w:right="1440" w:bottom="1440" w:left="1440" w:header="720" w:footer="720" w:gutter="0"/>
@@ -230,7 +245,7 @@
   <w:abstractNum w:abstractNumId="0" w15:restartNumberingAfterBreak="0">
     <w:nsid w:val="61827CBB"/>
     <w:multiLevelType w:val="hybridMultilevel"/>
-    <w:tmpl w:val="53C2B12A"/>
+    <w:tmpl w:val="D83635C4"/>
     <w:lvl w:ilvl="0" w:tplc="04090001">
       <w:start w:val="1"/>
       <w:numFmt w:val="bullet"/>

</xml_diff>

<commit_message>
Mark Project 3 complete and update portfolio README quick links.
Co-authored-by: Cursor <cursoragent@cursor.com>
</commit_message>
<xml_diff>
--- a/project-3-static-site/docs/Project 3 – Milestone Screenshots.docx
+++ b/project-3-static-site/docs/Project 3 – Milestone Screenshots.docx
@@ -12,6 +12,9 @@
     </w:p>
     <w:p>
       <w:r>
+        <w:rPr>
+          <w:noProof/>
+        </w:rPr>
         <w:drawing>
           <wp:inline distT="0" distB="0" distL="0" distR="0" wp14:anchorId="4E27300B" wp14:editId="16A9C004">
             <wp:extent cx="5943600" cy="1529715"/>
@@ -63,6 +66,9 @@
     </w:p>
     <w:p>
       <w:r>
+        <w:rPr>
+          <w:noProof/>
+        </w:rPr>
         <w:drawing>
           <wp:inline distT="0" distB="0" distL="0" distR="0" wp14:anchorId="1F3F8617" wp14:editId="2FBCD32D">
             <wp:extent cx="5943600" cy="325120"/>
@@ -126,6 +132,9 @@
     <w:p/>
     <w:p>
       <w:r>
+        <w:rPr>
+          <w:noProof/>
+        </w:rPr>
         <w:drawing>
           <wp:inline distT="0" distB="0" distL="0" distR="0" wp14:anchorId="36F260CB" wp14:editId="0B782284">
             <wp:extent cx="5468113" cy="2581635"/>
@@ -177,6 +186,9 @@
     </w:p>
     <w:p>
       <w:r>
+        <w:rPr>
+          <w:noProof/>
+        </w:rPr>
         <w:lastRenderedPageBreak/>
         <w:drawing>
           <wp:inline distT="0" distB="0" distL="0" distR="0" wp14:anchorId="72B9B39C" wp14:editId="592C4F26">
@@ -230,6 +242,100 @@
         <w:t>ite landing page</w:t>
       </w:r>
     </w:p>
+    <w:p>
+      <w:r>
+        <w:rPr>
+          <w:noProof/>
+        </w:rPr>
+        <w:lastRenderedPageBreak/>
+        <w:drawing>
+          <wp:inline distT="0" distB="0" distL="0" distR="0" wp14:anchorId="4E0A1CCA" wp14:editId="244BEF8B">
+            <wp:extent cx="5943600" cy="5682615"/>
+            <wp:effectExtent l="0" t="0" r="0" b="0"/>
+            <wp:docPr id="1217419308" name="Picture 1"/>
+            <wp:cNvGraphicFramePr>
+              <a:graphicFrameLocks xmlns:a="http://schemas.openxmlformats.org/drawingml/2006/main" noChangeAspect="1"/>
+            </wp:cNvGraphicFramePr>
+            <a:graphic xmlns:a="http://schemas.openxmlformats.org/drawingml/2006/main">
+              <a:graphicData uri="http://schemas.openxmlformats.org/drawingml/2006/picture">
+                <pic:pic xmlns:pic="http://schemas.openxmlformats.org/drawingml/2006/picture">
+                  <pic:nvPicPr>
+                    <pic:cNvPr id="1217419308" name=""/>
+                    <pic:cNvPicPr/>
+                  </pic:nvPicPr>
+                  <pic:blipFill>
+                    <a:blip r:embed="rId10"/>
+                    <a:stretch>
+                      <a:fillRect/>
+                    </a:stretch>
+                  </pic:blipFill>
+                  <pic:spPr>
+                    <a:xfrm>
+                      <a:off x="0" y="0"/>
+                      <a:ext cx="5943600" cy="5682615"/>
+                    </a:xfrm>
+                    <a:prstGeom prst="rect">
+                      <a:avLst/>
+                    </a:prstGeom>
+                  </pic:spPr>
+                </pic:pic>
+              </a:graphicData>
+            </a:graphic>
+          </wp:inline>
+        </w:drawing>
+      </w:r>
+    </w:p>
+    <w:p>
+      <w:pPr>
+        <w:pStyle w:val="ListParagraph"/>
+        <w:numPr>
+          <w:ilvl w:val="0"/>
+          <w:numId w:val="1"/>
+        </w:numPr>
+      </w:pPr>
+      <w:r>
+        <w:t>Budget created to monitor lab cost.</w:t>
+      </w:r>
+    </w:p>
+    <w:p>
+      <w:r>
+        <w:drawing>
+          <wp:inline distT="0" distB="0" distL="0" distR="0" wp14:anchorId="2DC366C1" wp14:editId="677748A1">
+            <wp:extent cx="5943600" cy="1456055"/>
+            <wp:effectExtent l="0" t="0" r="0" b="0"/>
+            <wp:docPr id="437207580" name="Picture 1"/>
+            <wp:cNvGraphicFramePr>
+              <a:graphicFrameLocks xmlns:a="http://schemas.openxmlformats.org/drawingml/2006/main" noChangeAspect="1"/>
+            </wp:cNvGraphicFramePr>
+            <a:graphic xmlns:a="http://schemas.openxmlformats.org/drawingml/2006/main">
+              <a:graphicData uri="http://schemas.openxmlformats.org/drawingml/2006/picture">
+                <pic:pic xmlns:pic="http://schemas.openxmlformats.org/drawingml/2006/picture">
+                  <pic:nvPicPr>
+                    <pic:cNvPr id="437207580" name=""/>
+                    <pic:cNvPicPr/>
+                  </pic:nvPicPr>
+                  <pic:blipFill>
+                    <a:blip r:embed="rId11"/>
+                    <a:stretch>
+                      <a:fillRect/>
+                    </a:stretch>
+                  </pic:blipFill>
+                  <pic:spPr>
+                    <a:xfrm>
+                      <a:off x="0" y="0"/>
+                      <a:ext cx="5943600" cy="1456055"/>
+                    </a:xfrm>
+                    <a:prstGeom prst="rect">
+                      <a:avLst/>
+                    </a:prstGeom>
+                  </pic:spPr>
+                </pic:pic>
+              </a:graphicData>
+            </a:graphic>
+          </wp:inline>
+        </w:drawing>
+      </w:r>
+    </w:p>
     <w:sectPr>
       <w:pgSz w:w="12240" w:h="15840"/>
       <w:pgMar w:top="1440" w:right="1440" w:bottom="1440" w:left="1440" w:header="720" w:footer="720" w:gutter="0"/>
@@ -245,7 +351,7 @@
   <w:abstractNum w:abstractNumId="0" w15:restartNumberingAfterBreak="0">
     <w:nsid w:val="61827CBB"/>
     <w:multiLevelType w:val="hybridMultilevel"/>
-    <w:tmpl w:val="D83635C4"/>
+    <w:tmpl w:val="0062F88A"/>
     <w:lvl w:ilvl="0" w:tplc="04090001">
       <w:start w:val="1"/>
       <w:numFmt w:val="bullet"/>

</xml_diff>